<commit_message>
feat: registratura primariei in datele de contact + sfatul de a cere numar de inregistrare
- registratura@primariapantelimon.ro in blocul de contact (petitie, modele, ghid 544)
- sfat vizibil: registratura in CC la fiecare cerere/petitie/reclamatie + cerere de numar
  de inregistrare (termenele curg de la inregistrare)
- linkurile mailto catre secretariat au registratura in CC; corpul cererii 544 cere nr.
- modelele Word: registratura in antet, fraza de cerere a numarului de inregistrare,
  sfat in subsol (Prefectura/ANAP: sfat generic)

Co-Authored-By: Claude Opus 5.5 <noreply@anthropic.com>
Claude-Session: https://claude.ai/code/session_01LXaXA5Z1Kv41HBK8frFD41
</commit_message>
<xml_diff>
--- a/modele/Cerere_544_documente_contract.docx
+++ b/modele/Cerere_544_documente_contract.docx
@@ -38,7 +38,20 @@
           <w:sz w:val="20"/>
           <w:szCs w:val="20"/>
         </w:rPr>
-        <w:t xml:space="preserve">E-mail: secretariat@primariapantelimon.ro  |  Tel.: 021 350 24 42 / 021 301 70 01  |  Fax: 021 301 70 75</w:t>
+        <w:t xml:space="preserve">E-mail: secretariat@primariapantelimon.ro  |  Registratura: registratura@primariapantelimon.ro</w:t>
+      </w:r>
+    </w:p>
+    <w:p>
+      <w:pPr>
+        <w:spacing w:after="40"/>
+      </w:pPr>
+      <w:r>
+        <w:rPr>
+          <w:color w:val="444444"/>
+          <w:sz w:val="20"/>
+          <w:szCs w:val="20"/>
+        </w:rPr>
+        <w:t xml:space="preserve">Tel.: 021 350 24 42 / 021 301 70 01  |  Fax: 021 301 70 75</w:t>
       </w:r>
     </w:p>
     <w:p>
@@ -289,6 +302,15 @@
       </w:pPr>
       <w:r>
         <w:t xml:space="preserve">Potrivit art. 7 alin. (1) din Legea nr. 544/2001, termenul de răspuns este de 10 zile de la înregistrare sau, pentru informații complexe, de cel mult 30 de zile.</w:t>
+      </w:r>
+    </w:p>
+    <w:p>
+      <w:pPr>
+        <w:spacing w:after="120" w:line="300"/>
+        <w:jc w:val="both"/>
+      </w:pPr>
+      <w:r>
+        <w:t xml:space="preserve">Vă rog să îmi comunicați numărul de înregistrare al prezentului document la adresa de e-mail de mai sus.</w:t>
       </w:r>
     </w:p>
     <w:p/>
@@ -383,7 +405,7 @@
         <w:sz w:val="16"/>
         <w:szCs w:val="16"/>
       </w:rPr>
-      <w:t xml:space="preserve">Model orientativ pus la dispoziție de transparenta-pantelimon.eu. Nu reprezintă consultanță juridică. Textul a fost redactat cu ajutorul unui instrument AI și revizuit; verificați datele, completați câmpurile marcate cu galben și adaptați-l situației dumneavoastră înainte de depunere. Datele de contact ale instituțiilor au fost preluate de pe site-urile oficiale la 28.09.2026 — verificați-le înainte de trimitere.</w:t>
+      <w:t xml:space="preserve">Model orientativ pus la dispoziție de transparenta-pantelimon.eu. Nu reprezintă consultanță juridică. Textul a fost redactat cu ajutorul unui instrument AI și revizuit; verificați datele, completați câmpurile marcate cu galben și adaptați-l situației dumneavoastră înainte de depunere. Datele de contact ale instituțiilor au fost preluate de pe site-urile oficiale la 28.09.2026 — verificați-le înainte de trimitere. Sfat: trimiteți documentul cu registratura@primariapantelimon.ro în CC și păstrați numărul de înregistrare primit.</w:t>
     </w:r>
   </w:p>
 </w:ftr>

</xml_diff>